<commit_message>
dashboard: 看板移到 docs/index.html 以发布 GitHub Pages
- 看板从 results/看板.html 移至 docs/index.html，可直接在线打开
- 同步更新 README / 项目说明书 / 操作手册 / 清理报告里的路径
- 修正 gen_report 里写死的样本量、更新补采后的数字
</commit_message>
<xml_diff>
--- a/README.docx
+++ b/README.docx
@@ -176,7 +176,22 @@
                 <w:rFonts w:ascii="微软雅黑" w:hAnsi="微软雅黑" w:eastAsia="微软雅黑"/>
                 <w:sz w:val="19"/>
               </w:rPr>
-              <w:t>双击 `results/看板.html`（单文件、断网可用、12 张可交互图表）</w:t>
+              <w:t>在线看：</w:t>
+            </w:r>
+            <w:r>
+              <w:rPr>
+                <w:rFonts w:ascii="微软雅黑" w:hAnsi="微软雅黑" w:eastAsia="微软雅黑"/>
+                <w:b/>
+                <w:sz w:val="19"/>
+              </w:rPr>
+              <w:t>https://arnoldwang-86.github.io/petkit-content-insight/</w:t>
+            </w:r>
+            <w:r>
+              <w:rPr>
+                <w:rFonts w:ascii="微软雅黑" w:hAnsi="微软雅黑" w:eastAsia="微软雅黑"/>
+                <w:sz w:val="19"/>
+              </w:rPr>
+              <w:t xml:space="preserve"> ；本地双击 `docs/index.html`</w:t>
             </w:r>
           </w:p>
         </w:tc>
@@ -837,7 +852,11 @@
         </w:rPr>
         <w:t>宠物智能硬件用户洞察/</w:t>
         <w:br/>
-        <w:t>├── results/              ★ 交付物：看板.html / 运营方案.docx / 13 个分析 CSV</w:t>
+        <w:t>├── docs/</w:t>
+        <w:br/>
+        <w:t>│   └── index.html        ★ 交互式看板（同时是 GitHub Pages 首页）</w:t>
+        <w:br/>
+        <w:t>├── results/              ★ 交付物：运营方案.docx / 13 个分析 CSV</w:t>
         <w:br/>
         <w:t>├── data/</w:t>
         <w:br/>

</xml_diff>